<commit_message>
Fill founder name in investor materials
Replace the {{اسم المؤسس}} placeholder with the founder's name
(عادل يحي احمد مدخلي) across the pitch page, deck, and feasibility
study, and note that Captain Adel is named after him.

Co-Authored-By: Claude Opus 4.8 <noreply@anthropic.com>
Claude-Session: https://claude.ai/code/session_01UqxyXCKAZWDhSN6Jr5o9ix
</commit_message>
<xml_diff>
--- a/docs/investor/fly-gaca-feasibility-ar.docx
+++ b/docs/investor/fly-gaca-feasibility-ar.docx
@@ -5956,7 +5956,7 @@
           <w:szCs w:val="22"/>
           <w:rtl/>
         </w:rPr>
-        <w:t xml:space="preserve">{{اسم المؤسس}} — المؤسس والمطوّر. </w:t>
+        <w:t xml:space="preserve">عادل يحي احمد مدخلي — المؤسس والمطوّر. </w:t>
       </w:r>
       <w:r>
         <w:rPr>
@@ -5970,42 +5970,7 @@
           <w:szCs w:val="22"/>
           <w:rtl/>
         </w:rPr>
-        <w:t xml:space="preserve">صاحب الفكرة والمطوّر الذي بنى المنصّة كاملة (الواجهة، الخلفية، والكوربوس التنظيمي) وبرمج مساعد كابتن عادل (RAG) بنفسه. منتج حيّ متكامل أنجزه مؤسس واحد — دليل قدرة تنفيذ ورأس مال بشري فعّال.</w:t>
-      </w:r>
-    </w:p>
-    <w:p>
-      <w:pPr>
-        <w:bidi/>
-        <w:spacing w:after="120" w:before="0" w:line="276"/>
-        <w:jc w:val="right"/>
-      </w:pPr>
-      <w:r>
-        <w:rPr>
-          <w:rFonts w:ascii="Arial" w:cs="Arial" w:eastAsia="Arial" w:hAnsi="Arial"/>
-          <w:b w:val="false"/>
-          <w:bCs w:val="false"/>
-          <w:i w:val="false"/>
-          <w:iCs w:val="false"/>
-          <w:color w:val="16212C"/>
-          <w:sz w:val="22"/>
-          <w:szCs w:val="22"/>
-          <w:rtl/>
-        </w:rPr>
-        <w:t xml:space="preserve">* </w:t>
-      </w:r>
-      <w:r>
-        <w:rPr>
-          <w:rFonts w:ascii="Arial" w:cs="Arial" w:eastAsia="Arial" w:hAnsi="Arial"/>
-          <w:b w:val="false"/>
-          <w:bCs w:val="false"/>
-          <w:i/>
-          <w:iCs/>
-          <w:color w:val="44515C"/>
-          <w:sz w:val="18"/>
-          <w:szCs w:val="18"/>
-          <w:rtl/>
-        </w:rPr>
-        <w:t xml:space="preserve">الاسم والسيرة placeholder يملؤها المؤسس قبل الإرسال للمستثمر.</w:t>
+        <w:t xml:space="preserve">صاحب الفكرة والمطوّر الذي بنى المنصّة كاملة (الواجهة، الخلفية، والكوربوس التنظيمي) وبرمج مساعد كابتن عادل (RAG) بنفسه — والمساعد يحمل اسمه. منتج حيّ متكامل أنجزه مؤسس واحد — دليل قدرة تنفيذ ورأس مال بشري فعّال.</w:t>
       </w:r>
     </w:p>
     <w:p>

</xml_diff>